<commit_message>
Updated: Changed the Cognizant Position
</commit_message>
<xml_diff>
--- a/DarshanSadashiva_Resume_Master.docx
+++ b/DarshanSadashiva_Resume_Master.docx
@@ -262,19 +262,8 @@
             <w:sz w:val="21"/>
             <w:szCs w:val="21"/>
           </w:rPr>
-          <w:t>linkedin.com/in/</w:t>
+          <w:t>linkedin.com/in/darshansadashiva</w:t>
         </w:r>
-        <w:proofErr w:type="spellStart"/>
-        <w:r>
-          <w:rPr>
-            <w:rStyle w:val="Hyperlink"/>
-            <w:rFonts w:ascii="Times New Roman" w:hAnsi="Times New Roman" w:cs="Times New Roman"/>
-            <w:sz w:val="21"/>
-            <w:szCs w:val="21"/>
-          </w:rPr>
-          <w:t>darshansadashiva</w:t>
-        </w:r>
-        <w:proofErr w:type="spellEnd"/>
       </w:hyperlink>
       <w:r>
         <w:rPr>
@@ -315,19 +304,8 @@
             <w:sz w:val="21"/>
             <w:szCs w:val="21"/>
           </w:rPr>
-          <w:t>github.com/</w:t>
+          <w:t>github.com/darshansadashiva</w:t>
         </w:r>
-        <w:proofErr w:type="spellStart"/>
-        <w:r>
-          <w:rPr>
-            <w:rStyle w:val="Hyperlink"/>
-            <w:rFonts w:ascii="Times New Roman" w:hAnsi="Times New Roman" w:cs="Times New Roman"/>
-            <w:sz w:val="21"/>
-            <w:szCs w:val="21"/>
-          </w:rPr>
-          <w:t>darshansadashiva</w:t>
-        </w:r>
-        <w:proofErr w:type="spellEnd"/>
       </w:hyperlink>
       <w:r>
         <w:rPr>
@@ -376,7 +354,6 @@
         <w:t xml:space="preserve"> </w:t>
       </w:r>
       <w:hyperlink r:id="rId8" w:history="1">
-        <w:proofErr w:type="spellStart"/>
         <w:r>
           <w:rPr>
             <w:rStyle w:val="Hyperlink"/>
@@ -386,7 +363,6 @@
           </w:rPr>
           <w:t>darshansadashiva.vercel.app</w:t>
         </w:r>
-        <w:proofErr w:type="spellEnd"/>
       </w:hyperlink>
     </w:p>
     <w:p>
@@ -573,13 +549,8 @@
         <w:textAlignment w:val="baseline"/>
       </w:pPr>
       <w:r>
-        <w:t xml:space="preserve">Familiar - Spring Boot, Angular, </w:t>
-      </w:r>
-      <w:proofErr w:type="spellStart"/>
-      <w:r>
-        <w:t>Hono</w:t>
-      </w:r>
-      <w:proofErr w:type="spellEnd"/>
+        <w:t>Familiar - Spring Boot, Angular, Hono</w:t>
+      </w:r>
     </w:p>
     <w:p>
       <w:pPr>
@@ -754,7 +725,16 @@
           <w:bCs/>
           <w:lang w:val="en-GB"/>
         </w:rPr>
-        <w:t xml:space="preserve">Programmer Analyst </w:t>
+        <w:t>Jr. Software Engineer</w:t>
+      </w:r>
+      <w:r>
+        <w:rPr>
+          <w:rFonts w:ascii="Times New Roman" w:hAnsi="Times New Roman" w:cs="Times New Roman"/>
+          <w:b/>
+          <w:bCs/>
+          <w:lang w:val="en-GB"/>
+        </w:rPr>
+        <w:t xml:space="preserve"> </w:t>
       </w:r>
       <w:r>
         <w:rPr>
@@ -801,19 +781,7 @@
         <w:rPr>
           <w:rFonts w:ascii="Times New Roman" w:hAnsi="Times New Roman" w:cs="Times New Roman"/>
         </w:rPr>
-        <w:t>Designed and built an internal automation suite (Python, Electron) that automated database query execution, Excel report generation, and a desktop dashboard</w:t>
-      </w:r>
-      <w:r>
-        <w:rPr>
-          <w:rFonts w:ascii="Times New Roman" w:hAnsi="Times New Roman" w:cs="Times New Roman"/>
-        </w:rPr>
-        <w:t>,</w:t>
-      </w:r>
-      <w:r>
-        <w:rPr>
-          <w:rFonts w:ascii="Times New Roman" w:hAnsi="Times New Roman" w:cs="Times New Roman"/>
-        </w:rPr>
-        <w:t xml:space="preserve"> eliminating </w:t>
+        <w:t xml:space="preserve">Designed and built an internal automation suite (Python, Electron) that automated database query execution, Excel report generation, and a desktop dashboard, eliminating </w:t>
       </w:r>
       <w:r>
         <w:rPr>
@@ -1013,7 +981,6 @@
           <w:lang w:val="en-GB"/>
         </w:rPr>
       </w:pPr>
-      <w:proofErr w:type="spellStart"/>
       <w:r>
         <w:rPr>
           <w:rFonts w:ascii="Times New Roman" w:hAnsi="Times New Roman" w:cs="Times New Roman"/>
@@ -1023,19 +990,7 @@
           <w:szCs w:val="24"/>
           <w:lang w:val="en-GB"/>
         </w:rPr>
-        <w:t>LuminAI</w:t>
-      </w:r>
-      <w:proofErr w:type="spellEnd"/>
-      <w:r>
-        <w:rPr>
-          <w:rFonts w:ascii="Times New Roman" w:hAnsi="Times New Roman" w:cs="Times New Roman"/>
-          <w:b/>
-          <w:bCs/>
-          <w:sz w:val="24"/>
-          <w:szCs w:val="24"/>
-          <w:lang w:val="en-GB"/>
-        </w:rPr>
-        <w:t xml:space="preserve">, </w:t>
+        <w:t xml:space="preserve">LuminAI, </w:t>
       </w:r>
       <w:r>
         <w:rPr>
@@ -1277,7 +1232,7 @@
               </wp:anchor>
             </w:drawing>
           </mc:Choice>
-          <mc:Fallback xmlns:oel="http://schemas.microsoft.com/office/2019/extlst" xmlns:w16du="http://schemas.microsoft.com/office/word/2023/wordml/word16du" xmlns:w16sdtfl="http://schemas.microsoft.com/office/word/2024/wordml/sdtformatlock">
+          <mc:Fallback xmlns:w16sdtfl="http://schemas.microsoft.com/office/word/2024/wordml/sdtformatlock" xmlns:w16du="http://schemas.microsoft.com/office/word/2023/wordml/word16du" xmlns:oel="http://schemas.microsoft.com/office/2019/extlst">
             <w:pict>
               <v:line w14:anchorId="4B3F6C52" id="Straight Connector 2" o:spid="_x0000_s1026" style="position:absolute;flip:y;z-index:251681792;visibility:visible;mso-wrap-style:square;mso-width-percent:0;mso-height-percent:0;mso-wrap-distance-left:9pt;mso-wrap-distance-top:0;mso-wrap-distance-right:9pt;mso-wrap-distance-bottom:0;mso-position-horizontal:absolute;mso-position-horizontal-relative:text;mso-position-vertical:absolute;mso-position-vertical-relative:text;mso-width-percent:0;mso-height-percent:0;mso-width-relative:margin;mso-height-relative:margin" from=".25pt,2.45pt" to="550.9pt,2.45pt" o:gfxdata="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" strokecolor="black [3200]" strokeweight="1.5pt">
                 <v:stroke joinstyle="miter"/>
@@ -1376,21 +1331,7 @@
         <w:rPr>
           <w:rFonts w:ascii="Times New Roman" w:hAnsi="Times New Roman" w:cs="Times New Roman"/>
         </w:rPr>
-        <w:t xml:space="preserve">Spring Boot, React, MySQL, Hibernate, Git, </w:t>
-      </w:r>
-      <w:proofErr w:type="spellStart"/>
-      <w:r>
-        <w:rPr>
-          <w:rFonts w:ascii="Times New Roman" w:hAnsi="Times New Roman" w:cs="Times New Roman"/>
-        </w:rPr>
-        <w:t>Jwt</w:t>
-      </w:r>
-      <w:proofErr w:type="spellEnd"/>
-      <w:r>
-        <w:rPr>
-          <w:rFonts w:ascii="Times New Roman" w:hAnsi="Times New Roman" w:cs="Times New Roman"/>
-        </w:rPr>
-        <w:t xml:space="preserve"> Auth </w:t>
+        <w:t xml:space="preserve">Spring Boot, React, MySQL, Hibernate, Git, Jwt Auth </w:t>
       </w:r>
     </w:p>
     <w:p>
@@ -1453,19 +1394,11 @@
         </w:rPr>
         <w:t xml:space="preserve"> </w:t>
       </w:r>
-      <w:proofErr w:type="spellStart"/>
-      <w:r>
-        <w:rPr>
-          <w:rFonts w:ascii="Times New Roman" w:hAnsi="Times New Roman" w:cs="Times New Roman"/>
-        </w:rPr>
-        <w:t>Hono</w:t>
-      </w:r>
-      <w:proofErr w:type="spellEnd"/>
-      <w:r>
-        <w:rPr>
-          <w:rFonts w:ascii="Times New Roman" w:hAnsi="Times New Roman" w:cs="Times New Roman"/>
-        </w:rPr>
-        <w:t xml:space="preserve">, </w:t>
+      <w:r>
+        <w:rPr>
+          <w:rFonts w:ascii="Times New Roman" w:hAnsi="Times New Roman" w:cs="Times New Roman"/>
+        </w:rPr>
+        <w:t xml:space="preserve">Hono, </w:t>
       </w:r>
       <w:r>
         <w:rPr>
@@ -1477,16 +1410,8 @@
         <w:rPr>
           <w:rFonts w:ascii="Times New Roman" w:hAnsi="Times New Roman" w:cs="Times New Roman"/>
         </w:rPr>
-        <w:t xml:space="preserve">Cloudflare, Git, </w:t>
-      </w:r>
-      <w:proofErr w:type="spellStart"/>
-      <w:r>
-        <w:rPr>
-          <w:rFonts w:ascii="Times New Roman" w:hAnsi="Times New Roman" w:cs="Times New Roman"/>
-        </w:rPr>
-        <w:t>Vercel</w:t>
-      </w:r>
-      <w:proofErr w:type="spellEnd"/>
+        <w:t>Cloudflare, Git, Vercel</w:t>
+      </w:r>
       <w:r>
         <w:t xml:space="preserve"> </w:t>
       </w:r>
@@ -1556,16 +1481,8 @@
         <w:rPr>
           <w:rFonts w:ascii="Times New Roman" w:hAnsi="Times New Roman" w:cs="Times New Roman"/>
         </w:rPr>
-        <w:t xml:space="preserve">, </w:t>
-      </w:r>
-      <w:proofErr w:type="spellStart"/>
-      <w:r>
-        <w:rPr>
-          <w:rFonts w:ascii="Times New Roman" w:hAnsi="Times New Roman" w:cs="Times New Roman"/>
-        </w:rPr>
-        <w:t>Vercel</w:t>
-      </w:r>
-      <w:proofErr w:type="spellEnd"/>
+        <w:t>, Vercel</w:t>
+      </w:r>
     </w:p>
     <w:p>
       <w:pPr>

</xml_diff>